<commit_message>
fix: stili Word italiano Titolo1/Titolo2 nei template (era Heading1/Heading2 inglese)
Made-with: Cursor
</commit_message>
<xml_diff>
--- a/app/public/templates/ISO14001-audit-report.docx
+++ b/app/public/templates/ISO14001-audit-report.docx
@@ -4,7 +4,7 @@
   <w:body>
     <w:p>
       <w:pPr>
-        <w:pStyle w:val="Heading1"/>
+        <w:pStyle w:val="Titolo1"/>
         <w:spacing w:before="200" w:after="200"/>
       </w:pPr>
       <w:r>
@@ -37,11 +37,11 @@
     </w:p>
     <w:p>
       <w:pPr>
-        <w:pStyle w:val="Heading1"/>
+        <w:pStyle w:val="Titolo1"/>
         <w:spacing w:before="0" w:after="300"/>
       </w:pPr>
       <w:r>
-        <w:t xml:space="preserve">1 – DATI GENERALI</w:t>
+        <w:t xml:space="preserve">1 â€“ DATI GENERALI</w:t>
       </w:r>
     </w:p>
     <w:tbl>
@@ -319,7 +319,7 @@
                 <w:szCs w:val="20"/>
                 <w:rFonts w:ascii="Arial" w:cs="Arial" w:eastAsia="Arial" w:hAnsi="Arial"/>
               </w:rPr>
-              <w:t xml:space="preserve">ATTIVITÀ/PROCESSI:</w:t>
+              <w:t xml:space="preserve">ATTIVITÃ€/PROCESSI:</w:t>
             </w:r>
           </w:p>
         </w:tc>
@@ -474,11 +474,11 @@
     </w:p>
     <w:p>
       <w:pPr>
-        <w:pStyle w:val="Heading1"/>
+        <w:pStyle w:val="Titolo1"/>
         <w:spacing w:before="0" w:after="300"/>
       </w:pPr>
       <w:r>
-        <w:t xml:space="preserve">2 – OBIETTIVO DELL'AUDIT</w:t>
+        <w:t xml:space="preserve">2 â€“ OBIETTIVO DELL'AUDIT</w:t>
       </w:r>
     </w:p>
     <w:p>
@@ -661,17 +661,17 @@
     </w:p>
     <w:p>
       <w:pPr>
-        <w:pStyle w:val="Heading1"/>
+        <w:pStyle w:val="Titolo1"/>
         <w:pageBreakBefore/>
         <w:spacing w:before="0" w:after="300"/>
       </w:pPr>
       <w:r>
-        <w:t xml:space="preserve">11 – ESITO DELL'AUDIT</w:t>
-      </w:r>
-    </w:p>
-    <w:p>
-      <w:pPr>
-        <w:pStyle w:val="Heading2"/>
+        <w:t xml:space="preserve">11 â€“ ESITO DELL'AUDIT</w:t>
+      </w:r>
+    </w:p>
+    <w:p>
+      <w:pPr>
+        <w:pStyle w:val="Titolo2"/>
         <w:spacing w:before="200" w:after="150"/>
       </w:pPr>
       <w:r>
@@ -688,7 +688,7 @@
     </w:p>
     <w:p>
       <w:pPr>
-        <w:pStyle w:val="Heading2"/>
+        <w:pStyle w:val="Titolo2"/>
         <w:spacing w:before="300" w:after="150"/>
         <w:jc w:val="center"/>
       </w:pPr>
@@ -713,7 +713,7 @@
     </w:p>
     <w:p>
       <w:pPr>
-        <w:pStyle w:val="Heading2"/>
+        <w:pStyle w:val="Titolo2"/>
         <w:spacing w:before="300" w:after="150"/>
       </w:pPr>
       <w:r>
@@ -759,7 +759,7 @@
                 <w:szCs w:val="22"/>
                 <w:rFonts w:ascii="Arial" w:cs="Arial" w:eastAsia="Arial" w:hAnsi="Arial"/>
               </w:rPr>
-              <w:t xml:space="preserve">Non Conformità (NC)</w:t>
+              <w:t xml:space="preserve">Non ConformitÃ  (NC)</w:t>
             </w:r>
           </w:p>
         </w:tc>
@@ -859,7 +859,7 @@
                 <w:szCs w:val="22"/>
                 <w:rFonts w:ascii="Arial" w:cs="Arial" w:eastAsia="Arial" w:hAnsi="Arial"/>
               </w:rPr>
-              <w:t xml:space="preserve">Opportunità di Miglioramento (OM)</w:t>
+              <w:t xml:space="preserve">OpportunitÃ  di Miglioramento (OM)</w:t>
             </w:r>
           </w:p>
         </w:tc>
@@ -1134,7 +1134,7 @@
               <w:szCs w:val="18"/>
               <w:rFonts w:ascii="Arial" w:cs="Arial" w:eastAsia="Arial" w:hAnsi="Arial"/>
             </w:rPr>
-            <w:t xml:space="preserve">Audit Conformità Legislativa ISO 14001</w:t>
+            <w:t xml:space="preserve">Audit ConformitÃ  Legislativa ISO 14001</w:t>
           </w:r>
         </w:p>
       </w:tc>
@@ -1471,12 +1471,13 @@
       <w:szCs w:val="20"/>
     </w:rPr>
   </w:style>
-  <w:style w:type="paragraph" w:styleId="Heading1">
-    <w:name w:val="Heading 1"/>
+  <w:style w:type="paragraph" w:styleId="Titolo1">
+    <w:name w:val="heading 1"/>
     <w:basedOn w:val="Normal"/>
     <w:next w:val="Normal"/>
     <w:pPr>
       <w:spacing w:before="400" w:after="200"/>
+      <w:outlineLvl w:val="0"/>
     </w:pPr>
     <w:rPr>
       <w:b/>
@@ -1487,12 +1488,13 @@
       <w:rFonts w:ascii="Arial" w:cs="Arial" w:eastAsia="Arial" w:hAnsi="Arial"/>
     </w:rPr>
   </w:style>
-  <w:style w:type="paragraph" w:styleId="Heading2">
-    <w:name w:val="Heading 2"/>
+  <w:style w:type="paragraph" w:styleId="Titolo2">
+    <w:name w:val="heading 2"/>
     <w:basedOn w:val="Normal"/>
     <w:next w:val="Normal"/>
     <w:pPr>
       <w:spacing w:before="300" w:after="150"/>
+      <w:outlineLvl w:val="1"/>
     </w:pPr>
     <w:rPr>
       <w:b/>
@@ -1503,12 +1505,13 @@
       <w:rFonts w:ascii="Arial" w:cs="Arial" w:eastAsia="Arial" w:hAnsi="Arial"/>
     </w:rPr>
   </w:style>
-  <w:style w:type="paragraph" w:styleId="Heading3">
-    <w:name w:val="Heading 3"/>
+  <w:style w:type="paragraph" w:styleId="Titolo3">
+    <w:name w:val="heading 3"/>
     <w:basedOn w:val="Normal"/>
     <w:next w:val="Normal"/>
     <w:pPr>
       <w:spacing w:before="200" w:after="100"/>
+      <w:outlineLvl w:val="2"/>
     </w:pPr>
     <w:rPr>
       <w:b/>

</xml_diff>

<commit_message>
fix: template ISO14001 caratteri corretti + stralci accessibili a tutti gli utenti autenticati
Made-with: Cursor
</commit_message>
<xml_diff>
--- a/app/public/templates/ISO14001-audit-report.docx
+++ b/app/public/templates/ISO14001-audit-report.docx
@@ -41,7 +41,7 @@
         <w:spacing w:before="0" w:after="300"/>
       </w:pPr>
       <w:r>
-        <w:t xml:space="preserve">1 â€“ DATI GENERALI</w:t>
+        <w:t xml:space="preserve">1 — DATI GENERALI</w:t>
       </w:r>
     </w:p>
     <w:tbl>
@@ -319,7 +319,7 @@
                 <w:szCs w:val="20"/>
                 <w:rFonts w:ascii="Arial" w:cs="Arial" w:eastAsia="Arial" w:hAnsi="Arial"/>
               </w:rPr>
-              <w:t xml:space="preserve">ATTIVITÃ€/PROCESSI:</w:t>
+              <w:t xml:space="preserve">ATTIVITÀ/PROCESSI:</w:t>
             </w:r>
           </w:p>
         </w:tc>
@@ -478,7 +478,7 @@
         <w:spacing w:before="0" w:after="300"/>
       </w:pPr>
       <w:r>
-        <w:t xml:space="preserve">2 â€“ OBIETTIVO DELL'AUDIT</w:t>
+        <w:t xml:space="preserve">2 — OBIETTIVO DELL'AUDIT</w:t>
       </w:r>
     </w:p>
     <w:p>
@@ -666,7 +666,7 @@
         <w:spacing w:before="0" w:after="300"/>
       </w:pPr>
       <w:r>
-        <w:t xml:space="preserve">11 â€“ ESITO DELL'AUDIT</w:t>
+        <w:t xml:space="preserve">11 — ESITO DELL'AUDIT</w:t>
       </w:r>
     </w:p>
     <w:p>
@@ -759,7 +759,7 @@
                 <w:szCs w:val="22"/>
                 <w:rFonts w:ascii="Arial" w:cs="Arial" w:eastAsia="Arial" w:hAnsi="Arial"/>
               </w:rPr>
-              <w:t xml:space="preserve">Non ConformitÃ  (NC)</w:t>
+              <w:t xml:space="preserve">Non Conformità (NC)</w:t>
             </w:r>
           </w:p>
         </w:tc>
@@ -859,7 +859,7 @@
                 <w:szCs w:val="22"/>
                 <w:rFonts w:ascii="Arial" w:cs="Arial" w:eastAsia="Arial" w:hAnsi="Arial"/>
               </w:rPr>
-              <w:t xml:space="preserve">OpportunitÃ  di Miglioramento (OM)</w:t>
+              <w:t xml:space="preserve">Opportunità di Miglioramento (OM)</w:t>
             </w:r>
           </w:p>
         </w:tc>
@@ -1134,7 +1134,7 @@
               <w:szCs w:val="18"/>
               <w:rFonts w:ascii="Arial" w:cs="Arial" w:eastAsia="Arial" w:hAnsi="Arial"/>
             </w:rPr>
-            <w:t xml:space="preserve">Audit ConformitÃ  Legislativa ISO 14001</w:t>
+            <w:t xml:space="preserve">Audit Conformità Legislativa ISO 14001</w:t>
           </w:r>
         </w:p>
       </w:tc>

</xml_diff>